<commit_message>
Review fixes: McNemar test per snippet length, run-independent timing text, capacity confound, CPU time and Figure 3 spacing
</commit_message>
<xml_diff>
--- a/Deep_Learning_Systems_Analysis_Report.docx
+++ b/Deep_Learning_Systems_Analysis_Report.docx
@@ -251,7 +251,7 @@
         <w:rPr>
           <w:b w:val="0"/>
         </w:rPr>
-        <w:t>The BiGRU experiment outperformed the Transformer baseline at every snippet length (Figure 2). With 10 characters, test accuracy was 0.8242 for the BiGRU against 0.8094 for the Transformer; with 20 characters, 0.9673 against 0.9580; with 40 characters, 0.9969 against 0.9954; and with 64 characters, 0.9988 against 0.9973. Macro-F1 followed accuracy closely because the six languages are almost perfectly balanced. The BiGRU achieved this with a third of the parameters (94,086 against 284,550) and about half the training time (117 against 220 seconds on the GPU), and it also reached a higher best validation accuracy (0.9780 against 0.9712). The advantage is largest exactly where the task is hardest, on the shortest snippets, which supports the hypothesis that a bias toward local character order is useful when there is little text to attend over.</w:t>
+        <w:t>The BiGRU experiment outperformed the Transformer baseline at every snippet length (Figure 2). With 10 characters, test accuracy was 0.8242 for the BiGRU against 0.8094 for the Transformer; with 20 characters, 0.9673 against 0.9580; with 40 characters, 0.9969 against 0.9954; and with 64 characters, 0.9988 against 0.9973. Macro-F1 followed accuracy closely because the six languages are almost perfectly balanced. The BiGRU achieved this with a third of the parameters (94,086 against 284,550) and less training time (140 against 252 seconds on the GPU in the submitted run, 55 % of the baseline's time; wall-clock times vary between runs), and it also reached a higher best validation accuracy (0.9780 against 0.9712). Because both models were scored on the same snippets, the differences were tested with McNemar's exact test on the paired predictions, which considers only the snippets on which the two models disagree (McNemar, 1947). The BiGRU was significantly better at every length (p &lt; 0.001; at 10 characters it was the only correct model on 1,942 snippets against 1,547 for the Transformer), but at 40 and 64 characters both models are near the ceiling and the absolute gain is only 0.15 and 0.14 percentage points. These tests compare one trained model of each kind, so they do not capture variability across random seeds. The advantage is largest exactly where the task is hardest, on the shortest snippets, which supports the hypothesis that a bias toward local character order is useful when there is little text to attend over.</w:t>
       </w:r>
     </w:p>
     <w:p>
@@ -449,7 +449,7 @@
       <w:r>
         <w:drawing>
           <wp:inline xmlns:a="http://schemas.openxmlformats.org/drawingml/2006/main" xmlns:pic="http://schemas.openxmlformats.org/drawingml/2006/picture">
-            <wp:extent cx="5760720" cy="2455798"/>
+            <wp:extent cx="5760720" cy="2763399"/>
             <wp:docPr id="3" name="Picture 3"/>
             <wp:cNvGraphicFramePr>
               <a:graphicFrameLocks noChangeAspect="1"/>
@@ -470,7 +470,7 @@
                   <pic:spPr>
                     <a:xfrm>
                       <a:off x="0" y="0"/>
-                      <a:ext cx="5760720" cy="2455798"/>
+                      <a:ext cx="5760720" cy="2763399"/>
                     </a:xfrm>
                     <a:prstGeom prst="rect"/>
                   </pic:spPr>
@@ -512,7 +512,7 @@
         <w:rPr>
           <w:b w:val="0"/>
         </w:rPr>
-        <w:t>The most important limitation is the domain. All training and test text comes from Bible translations, which use a formal, religious and in some cases archaic register (the Romanian edition uses the spelling in force before 1993, with î where current Romanian writes â, and Latin is a classical language), so the reported accuracy is an estimate for this kind of text, not for everyday social-media posts with slang, spelling mistakes, emoji or code-switching between languages. The chapter-level split prevents content leakage, but the test chapters still come from the same six translations, so the evaluation does not measure how the models behave on other translations or authors. The label is also imperfect for very short inputs: a 10-character snippet can be a valid string in several of these languages, which caps the achievable accuracy and makes part of the error unavoidable. The comparison is limited to one training budget of 12 epochs; because both models were still improving, a longer schedule might narrow or change the gap between them, and only one random seed was trained per configuration. Finally, the repair of the Portuguese encoding error assumes that every replacement character stands for the crase, which is true for almost all occurrences but introduces a few wrong letters in words such as não.</w:t>
+        <w:t>The most important limitation is the domain. All training and test text comes from Bible translations, which use a formal, religious and in some cases archaic register (the Romanian edition uses the spelling in force before 1993, with î where current Romanian writes â, and Latin is a classical language), so the reported accuracy is an estimate for this kind of text, not for everyday social-media posts with slang, spelling mistakes, emoji or code-switching between languages. The chapter-level split prevents content leakage, but the test chapters still come from the same six translations, so the evaluation does not measure how the models behave on other translations or authors. The label is also imperfect for very short inputs: a 10-character snippet can be a valid string in several of these languages, which caps the achievable accuracy and makes part of the error unavoidable. The comparison is limited to one training budget of 12 epochs and one random seed per configuration; because both models were still improving, a longer schedule might narrow or change the gap between them. Changing the layer type also changed the depth (two Transformer layers against one GRU layer) and the capacity (284,550 against 94,086 parameters), so part of the GRU's advantage could come from a smaller model converging faster within the same budget rather than from the recurrent inductive bias alone; the experiment changes one aspect, the architecture, but it cannot separate these two explanations. Finally, the repair of the Portuguese encoding error assumes that every replacement character stands for the crase, which is true for almost all occurrences but introduces a few wrong letters in words such as não.</w:t>
       </w:r>
     </w:p>
     <w:p>
@@ -726,6 +726,26 @@
       <w:r>
         <w:rPr/>
         <w:t>, 1929–1958. https://jmlr.org/papers/v15/srivastava14a.html</w:t>
+      </w:r>
+    </w:p>
+    <w:p>
+      <w:pPr>
+        <w:spacing w:line="480" w:lineRule="auto"/>
+        <w:ind w:left="720" w:hanging="720"/>
+      </w:pPr>
+      <w:r>
+        <w:rPr/>
+        <w:t xml:space="preserve">McNemar, Q. (1947). Note on the sampling error of the difference between correlated proportions or percentages. </w:t>
+      </w:r>
+      <w:r>
+        <w:rPr>
+          <w:i/>
+        </w:rPr>
+        <w:t>Psychometrika, 12</w:t>
+      </w:r>
+      <w:r>
+        <w:rPr/>
+        <w:t>(2), 153–157. https://doi.org/10.1007/BF02295996</w:t>
       </w:r>
     </w:p>
     <w:p>

</xml_diff>